<commit_message>
2026-08-31 - UPDATED: revised website content, major rewrite using new features and promote the account, less the directory listing.
</commit_message>
<xml_diff>
--- a/assets/documents/MLSB_System_Design_v1.2.docx
+++ b/assets/documents/MLSB_System_Design_v1.2.docx
@@ -40,13 +40,7 @@
         <w:jc w:val="center"/>
       </w:pPr>
       <w:r>
-        <w:rPr>
-          <w:rFonts w:ascii="Arial" w:cs="Arial" w:eastAsia="Arial" w:hAnsi="Arial"/>
-          <w:color w:val="888888"/>
-          <w:sz w:val="24"/>
-          <w:szCs w:val="24"/>
-        </w:rPr>
-        <w:t xml:space="preserve">Version 1.2 — Revised</w:t>
+        <w:t>Version 1.2 - Revised</w:t>
       </w:r>
     </w:p>
     <w:p>
@@ -55,15 +49,7 @@
         <w:jc w:val="center"/>
       </w:pPr>
       <w:r>
-        <w:rPr>
-          <w:rFonts w:ascii="Arial" w:cs="Arial" w:eastAsia="Arial" w:hAnsi="Arial"/>
-          <w:i/>
-          <w:iCs/>
-          <w:color w:val="888888"/>
-          <w:sz w:val="20"/>
-          <w:szCs w:val="20"/>
-        </w:rPr>
-        <w:t xml:space="preserve">Version 1.2 adds a per-template colour scheme picker (around four named accent palettes per template) and a sole-trader voice toggle that switches mini-site headings between "us" and "me". It builds on Version 1.1, which introduced standard default policy pages (Privacy and Terms) on every plan with paid customisation, revert, and extra pages; an optional Google map of the primary address; superadmin 'manage mode' in place of owner impersonation; concise area phrasing on mini-sites; and the short description limit raised from 160 to 250 characters.</w:t>
+        <w:t>This revision makes the product account-first: every registered business receives a free single-page mini-site, basic online bookings and a diary. Events are also free. Premium adds advanced business tools, including invoicing and newsletters, alongside premium presentation and promotion features. Version 1.2 added per-template colour schemes and a sole-trader voice toggle; it also introduced standard Privacy and Terms policy pages on every plan, with paid customisation of those existing policy pages.</w:t>
       </w:r>
     </w:p>
     <w:p>
@@ -76,11 +62,7 @@
     </w:p>
     <w:p>
       <w:r>
-        <w:rPr>
-          <w:sz w:val="24"/>
-          <w:szCs w:val="24"/>
-        </w:rPr>
-        <w:t>My Local Small Business (MLSB) is a hosted platform that gives UK small business owners a simple, self-managed web presence called a mini-site. Each mini-site lives at a short URL (https://mlsb.uk/[slug]) and is rendered on-the-fly from a central database. The platform includes a public search homepage, a business owner admin dashboard, and a platform superadmin panel.</w:t>
+        <w:t>My Local Small Business (MLSB) is a hosted, account-first platform that gives UK small business owners a simple, self-managed single-page web presence called a mini-site, plus customer bookings and a diary. Each mini-site lives at a short URL (https://mlsb.uk/[slug]) and is rendered on-the-fly from a central database. The public search homepage is an included discovery channel rather than the primary product. The platform includes a business owner dashboard and a platform superadmin panel.</w:t>
       </w:r>
     </w:p>
     <w:p>
@@ -90,11 +72,7 @@
     </w:p>
     <w:p>
       <w:r>
-        <w:rPr>
-          <w:sz w:val="24"/>
-          <w:szCs w:val="24"/>
-        </w:rPr>
-        <w:t xml:space="preserve">The platform is designed to grow over time with a freemium model: a free tier for all registered businesses, time-limited free trials for premium features, and a paid tier unlocking extended capabilities.</w:t>
+        <w:t>The platform uses a freemium model: the free tier includes the core mini-site, basic bookings, diary and events. Time-limited trials expose Premium features, while a paid tier unlocks advanced tools such as invoices and newsletters, plus extended presentation and promotion capabilities.</w:t>
       </w:r>
     </w:p>
     <w:p>
@@ -346,13 +324,7 @@
           </w:tcPr>
           <w:p>
             <w:r>
-              <w:rPr>
-                <w:b w:val="false"/>
-                <w:bCs w:val="false"/>
-                <w:sz w:val="22"/>
-                <w:szCs w:val="22"/>
-              </w:rPr>
-              <w:t xml:space="preserve">Core mini-site, limited sections</w:t>
+              <w:t>Single-page mini-site, basic bookings, diary, events and core content features</w:t>
             </w:r>
           </w:p>
         </w:tc>
@@ -432,13 +404,7 @@
           </w:tcPr>
           <w:p>
             <w:r>
-              <w:rPr>
-                <w:b w:val="false"/>
-                <w:bCs w:val="false"/>
-                <w:sz w:val="22"/>
-                <w:szCs w:val="22"/>
-              </w:rPr>
-              <w:t xml:space="preserve">Access to paid features during trial period</w:t>
+              <w:t>Time-limited access to Premium features, including invoices and newsletters</w:t>
             </w:r>
           </w:p>
         </w:tc>
@@ -518,13 +484,7 @@
           </w:tcPr>
           <w:p>
             <w:r>
-              <w:rPr>
-                <w:b w:val="false"/>
-                <w:bCs w:val="false"/>
-                <w:sz w:val="22"/>
-                <w:szCs w:val="22"/>
-              </w:rPr>
-              <w:t xml:space="preserve">All features, extended limits</w:t>
+              <w:t>All features, extended limits and advanced business tools</w:t>
             </w:r>
           </w:p>
         </w:tc>
@@ -853,11 +813,7 @@
     </w:p>
     <w:p>
       <w:r>
-        <w:rPr>
-          <w:sz w:val="24"/>
-          <w:szCs w:val="24"/>
-        </w:rPr>
-        <w:t xml:space="preserve">The section builder assembles the mini-site from the active content blocks configured by the owner: header, description, contact details, galleries, price lists, menus, articles, callout boxes, contact form, and footer.</w:t>
+        <w:t>The section builder assembles the mini-site from the active content blocks configured by the owner: header, description, contact details, galleries, price lists, menus, articles, events, booking entry point, callout boxes, contact form and footer.</w:t>
       </w:r>
     </w:p>
     <w:p>
@@ -1726,6 +1682,138 @@
           </w:p>
         </w:tc>
       </w:tr>
+      <w:tr>
+        <w:tc>
+          <w:tcPr>
+            <w:tcW w:type="dxa" w:w="3120"/>
+          </w:tcPr>
+          <w:p>
+            <w:r>
+              <w:t>bookable_services</w:t>
+            </w:r>
+          </w:p>
+        </w:tc>
+        <w:tc>
+          <w:tcPr>
+            <w:tcW w:type="dxa" w:w="6240"/>
+          </w:tcPr>
+          <w:p>
+            <w:r>
+              <w:t>id, business_id, name, description, duration_minutes, is_active, display_order</w:t>
+            </w:r>
+          </w:p>
+        </w:tc>
+      </w:tr>
+      <w:tr>
+        <w:tc>
+          <w:tcPr>
+            <w:tcW w:type="dxa" w:w="3120"/>
+          </w:tcPr>
+          <w:p>
+            <w:r>
+              <w:t>booking_availability</w:t>
+            </w:r>
+          </w:p>
+        </w:tc>
+        <w:tc>
+          <w:tcPr>
+            <w:tcW w:type="dxa" w:w="6240"/>
+          </w:tcPr>
+          <w:p>
+            <w:r>
+              <w:t>id, business_id, day_of_week, start_time, end_time, is_available</w:t>
+            </w:r>
+          </w:p>
+        </w:tc>
+      </w:tr>
+      <w:tr>
+        <w:tc>
+          <w:tcPr>
+            <w:tcW w:type="dxa" w:w="3120"/>
+          </w:tcPr>
+          <w:p>
+            <w:r>
+              <w:t>bookings</w:t>
+            </w:r>
+          </w:p>
+        </w:tc>
+        <w:tc>
+          <w:tcPr>
+            <w:tcW w:type="dxa" w:w="6240"/>
+          </w:tcPr>
+          <w:p>
+            <w:r>
+              <w:t>id, business_id, bookable_service_id, customer_name, customer_email, starts_at, ends_at, status, confirmation_sent_at, cancellation_sent_at, created_at</w:t>
+            </w:r>
+          </w:p>
+        </w:tc>
+      </w:tr>
+      <w:tr>
+        <w:tc>
+          <w:tcPr>
+            <w:tcW w:type="dxa" w:w="3120"/>
+          </w:tcPr>
+          <w:p>
+            <w:r>
+              <w:t>events</w:t>
+            </w:r>
+          </w:p>
+        </w:tc>
+        <w:tc>
+          <w:tcPr>
+            <w:tcW w:type="dxa" w:w="6240"/>
+          </w:tcPr>
+          <w:p>
+            <w:r>
+              <w:t>id, business_id, title, description, starts_at, ends_at, location, is_published, display_order</w:t>
+            </w:r>
+          </w:p>
+        </w:tc>
+      </w:tr>
+      <w:tr>
+        <w:tc>
+          <w:tcPr>
+            <w:tcW w:type="dxa" w:w="3120"/>
+          </w:tcPr>
+          <w:p>
+            <w:r>
+              <w:t>newsletters</w:t>
+            </w:r>
+          </w:p>
+        </w:tc>
+        <w:tc>
+          <w:tcPr>
+            <w:tcW w:type="dxa" w:w="6240"/>
+          </w:tcPr>
+          <w:p>
+            <w:r>
+              <w:t>id, business_id, subject, body_html, status, scheduled_at, sent_at; Premium only</w:t>
+            </w:r>
+          </w:p>
+        </w:tc>
+      </w:tr>
+      <w:tr>
+        <w:tc>
+          <w:tcPr>
+            <w:tcW w:type="dxa" w:w="3120"/>
+          </w:tcPr>
+          <w:p>
+            <w:r>
+              <w:t>invoices</w:t>
+            </w:r>
+          </w:p>
+        </w:tc>
+        <w:tc>
+          <w:tcPr>
+            <w:tcW w:type="dxa" w:w="6240"/>
+          </w:tcPr>
+          <w:p>
+            <w:r>
+              <w:t>id, business_id, booking_id (nullable), customer_name, customer_email, issue_date, due_date, total, status, sent_at; Premium only</w:t>
+            </w:r>
+          </w:p>
+        </w:tc>
+      </w:tr>
     </w:tbl>
     <w:p>
       <w:r>
@@ -2596,11 +2684,7 @@
           </w:tcPr>
           <w:p>
             <w:r>
-              <w:rPr>
-                <w:sz w:val="22"/>
-                <w:szCs w:val="22"/>
-              </w:rPr>
-              <w:t xml:space="preserve">id, business_id, page_type (terms/privacy/cookies/other), title, body_html, updated_at. A row overrides the built-in default for that page type; with no row, the standard default is shown.</w:t>
+              <w:t>id, business_id, page_type (terms/privacy/cookies), title, body_html, updated_at. A row overrides the built-in default for that policy type; with no row, the standard default is shown. Policy pages are not additional mini-site content pages.</w:t>
             </w:r>
           </w:p>
         </w:tc>
@@ -2708,11 +2792,7 @@
           </w:tcPr>
           <w:p>
             <w:r>
-              <w:rPr>
-                <w:sz w:val="22"/>
-                <w:szCs w:val="22"/>
-              </w:rPr>
-              <w:t xml:space="preserve">id (= business_id), template_id, color_scheme, singular_voice, copyright_text, show_address, show_phone, show_contact_form, show_galleries, show_price_lists, show_menus, show_articles, show_callouts, show_policies, show_map</w:t>
+              <w:t>id (= business_id), template_id, color_scheme, singular_voice, copyright_text, show_address, show_phone, show_contact_form, show_galleries, show_price_lists, show_menus, show_articles, show_events, show_bookings, show_callouts, show_policies, show_map</w:t>
             </w:r>
           </w:p>
         </w:tc>
@@ -4268,6 +4348,50 @@
           </w:p>
         </w:tc>
       </w:tr>
+      <w:tr>
+        <w:tc>
+          <w:tcPr>
+            <w:tcW w:type="dxa" w:w="3120"/>
+          </w:tcPr>
+          <w:p>
+            <w:r>
+              <w:t>Events</w:t>
+            </w:r>
+          </w:p>
+        </w:tc>
+        <w:tc>
+          <w:tcPr>
+            <w:tcW w:type="dxa" w:w="6240"/>
+          </w:tcPr>
+          <w:p>
+            <w:r>
+              <w:t>Published upcoming events appear on the mini-site and may also appear in directory search results. Available on the free tier.</w:t>
+            </w:r>
+          </w:p>
+        </w:tc>
+      </w:tr>
+      <w:tr>
+        <w:tc>
+          <w:tcPr>
+            <w:tcW w:type="dxa" w:w="3120"/>
+          </w:tcPr>
+          <w:p>
+            <w:r>
+              <w:t>Bookings</w:t>
+            </w:r>
+          </w:p>
+        </w:tc>
+        <w:tc>
+          <w:tcPr>
+            <w:tcW w:type="dxa" w:w="6240"/>
+          </w:tcPr>
+          <w:p>
+            <w:r>
+              <w:t>A booking entry point lets customers book an available appointment, room or venue. The basic booking flow and diary are available on the free tier.</w:t>
+            </w:r>
+          </w:p>
+        </w:tc>
+      </w:tr>
     </w:tbl>
     <w:p>
       <w:r>
@@ -4723,6 +4847,28 @@
           </w:p>
         </w:tc>
       </w:tr>
+      <w:tr>
+        <w:tc>
+          <w:tcPr>
+            <w:tcW w:type="dxa" w:w="3120"/>
+          </w:tcPr>
+          <w:p>
+            <w:r>
+              <w:t>Booking settings</w:t>
+            </w:r>
+          </w:p>
+        </w:tc>
+        <w:tc>
+          <w:tcPr>
+            <w:tcW w:type="dxa" w:w="6240"/>
+          </w:tcPr>
+          <w:p>
+            <w:r>
+              <w:t>Create bookable services, set availability and manage the diary. Basic booking and diary functionality is available on the free tier.</w:t>
+            </w:r>
+          </w:p>
+        </w:tc>
+      </w:tr>
     </w:tbl>
     <w:p>
       <w:r>
@@ -5425,11 +5571,7 @@
           </w:tcPr>
           <w:p>
             <w:r>
-              <w:rPr>
-                <w:sz w:val="22"/>
-                <w:szCs w:val="22"/>
-              </w:rPr>
-              <w:t xml:space="preserve">Every mini-site is provided with standard default Privacy Policy and Terms &amp; Conditions pages, shown on all plans. On a paid plan the owner can customise these (which overrides the default for that page), revert to the default, and add further pages such as a cookie policy. A per-site toggle controls whether the policy links appear in the footer. Policy pages are reachable at /[slug]/policy/[type].</w:t>
+              <w:t>Every mini-site has standard Privacy Policy and Terms &amp; Conditions pages, shown on all plans. On a paid plan the owner can customise these existing policy pages and revert to the defaults. A per-site toggle controls whether policy links appear in the footer. Policy pages are reachable at /[slug]/policy/[type]; owners cannot add further mini-site content pages.</w:t>
             </w:r>
           </w:p>
         </w:tc>
@@ -5486,6 +5628,94 @@
                 <w:szCs w:val="22"/>
               </w:rPr>
               <w:t xml:space="preserve">Drag-and-drop reordering of content blocks on the mini-site. Toggle blocks on/off.</w:t>
+            </w:r>
+          </w:p>
+        </w:tc>
+      </w:tr>
+      <w:tr>
+        <w:tc>
+          <w:tcPr>
+            <w:tcW w:type="dxa" w:w="3120"/>
+          </w:tcPr>
+          <w:p>
+            <w:r>
+              <w:t>Events</w:t>
+            </w:r>
+          </w:p>
+        </w:tc>
+        <w:tc>
+          <w:tcPr>
+            <w:tcW w:type="dxa" w:w="6240"/>
+          </w:tcPr>
+          <w:p>
+            <w:r>
+              <w:t>Create, publish, edit and unpublish upcoming events. Events are available on the free tier and can appear in directory search results.</w:t>
+            </w:r>
+          </w:p>
+        </w:tc>
+      </w:tr>
+      <w:tr>
+        <w:tc>
+          <w:tcPr>
+            <w:tcW w:type="dxa" w:w="3120"/>
+          </w:tcPr>
+          <w:p>
+            <w:r>
+              <w:t>Bookings and diary</w:t>
+            </w:r>
+          </w:p>
+        </w:tc>
+        <w:tc>
+          <w:tcPr>
+            <w:tcW w:type="dxa" w:w="6240"/>
+          </w:tcPr>
+          <w:p>
+            <w:r>
+              <w:t>Create bookable services, set availability, view upcoming bookings and handle cancellations. Customer confirmation and cancellation emails are sent for the basic free booking flow.</w:t>
+            </w:r>
+          </w:p>
+        </w:tc>
+      </w:tr>
+      <w:tr>
+        <w:tc>
+          <w:tcPr>
+            <w:tcW w:type="dxa" w:w="3120"/>
+          </w:tcPr>
+          <w:p>
+            <w:r>
+              <w:t>Newsletters</w:t>
+            </w:r>
+          </w:p>
+        </w:tc>
+        <w:tc>
+          <w:tcPr>
+            <w:tcW w:type="dxa" w:w="6240"/>
+          </w:tcPr>
+          <w:p>
+            <w:r>
+              <w:t>Create, schedule and send customer newsletters. Available with Premium.</w:t>
+            </w:r>
+          </w:p>
+        </w:tc>
+      </w:tr>
+      <w:tr>
+        <w:tc>
+          <w:tcPr>
+            <w:tcW w:type="dxa" w:w="3120"/>
+          </w:tcPr>
+          <w:p>
+            <w:r>
+              <w:t>Invoices</w:t>
+            </w:r>
+          </w:p>
+        </w:tc>
+        <w:tc>
+          <w:tcPr>
+            <w:tcW w:type="dxa" w:w="6240"/>
+          </w:tcPr>
+          <w:p>
+            <w:r>
+              <w:t>Create and send invoices, optionally linked to a booking. Available with Premium.</w:t>
             </w:r>
           </w:p>
         </w:tc>
@@ -7209,16 +7439,12 @@
         <w:pStyle w:val="Heading1"/>
       </w:pPr>
       <w:r>
-        <w:t xml:space="preserve">12. Freemium and plan gating</w:t>
-      </w:r>
-    </w:p>
-    <w:p>
-      <w:r>
-        <w:rPr>
-          <w:sz w:val="24"/>
-          <w:szCs w:val="24"/>
-        </w:rPr>
-        <w:t xml:space="preserve">All features should be designed with plan-gating in mind from the start, even if initially all features are free. The plan_tier field on the businesses table (free / trial / paid) is the source of truth.</w:t>
+        <w:t>12. Freemium and plan gating</w:t>
+      </w:r>
+    </w:p>
+    <w:p>
+      <w:r>
+        <w:t>All features should be designed with plan-gating in mind from the start. The plan_tier field on the businesses table (free / trial / paid) is the source of truth. Basic bookings, diary and events are free features; Premium gates advanced tools such as invoicing and newsletters.</w:t>
       </w:r>
     </w:p>
     <w:p>
@@ -8328,13 +8554,7 @@
           </w:tcPr>
           <w:p>
             <w:r>
-              <w:rPr>
-                <w:b w:val="false"/>
-                <w:bCs w:val="false"/>
-                <w:sz w:val="22"/>
-                <w:szCs w:val="22"/>
-              </w:rPr>
-              <w:t xml:space="preserve">Standard Privacy &amp; Terms (shown, not editable)</w:t>
+              <w:t>Standard Privacy &amp; Terms (shown, not editable)</w:t>
             </w:r>
           </w:p>
         </w:tc>
@@ -8356,13 +8576,135 @@
           </w:tcPr>
           <w:p>
             <w:r>
-              <w:rPr>
-                <w:b w:val="false"/>
-                <w:bCs w:val="false"/>
-                <w:sz w:val="22"/>
-                <w:szCs w:val="22"/>
-              </w:rPr>
-              <w:t xml:space="preserve">Customise defaults, revert, add extra pages</w:t>
+              <w:t>Customise and revert the existing default policy pages; no extra mini-site content pages</w:t>
+            </w:r>
+          </w:p>
+        </w:tc>
+      </w:tr>
+      <w:tr>
+        <w:tc>
+          <w:tcPr>
+            <w:tcW w:type="dxa" w:w="2500"/>
+          </w:tcPr>
+          <w:p>
+            <w:r>
+              <w:t>Events</w:t>
+            </w:r>
+          </w:p>
+        </w:tc>
+        <w:tc>
+          <w:tcPr>
+            <w:tcW w:type="dxa" w:w="3500"/>
+          </w:tcPr>
+          <w:p>
+            <w:r>
+              <w:t>Create and publish events</w:t>
+            </w:r>
+          </w:p>
+        </w:tc>
+        <w:tc>
+          <w:tcPr>
+            <w:tcW w:type="dxa" w:w="3360"/>
+          </w:tcPr>
+          <w:p>
+            <w:r>
+              <w:t>Create and publish events</w:t>
+            </w:r>
+          </w:p>
+        </w:tc>
+      </w:tr>
+      <w:tr>
+        <w:tc>
+          <w:tcPr>
+            <w:tcW w:type="dxa" w:w="2500"/>
+          </w:tcPr>
+          <w:p>
+            <w:r>
+              <w:t>Bookings and diary</w:t>
+            </w:r>
+          </w:p>
+        </w:tc>
+        <w:tc>
+          <w:tcPr>
+            <w:tcW w:type="dxa" w:w="3500"/>
+          </w:tcPr>
+          <w:p>
+            <w:r>
+              <w:t>Basic bookable services, availability, booking diary, confirmations and cancellations</w:t>
+            </w:r>
+          </w:p>
+        </w:tc>
+        <w:tc>
+          <w:tcPr>
+            <w:tcW w:type="dxa" w:w="3360"/>
+          </w:tcPr>
+          <w:p>
+            <w:r>
+              <w:t>Everything in Free, with Premium extensions where available</w:t>
+            </w:r>
+          </w:p>
+        </w:tc>
+      </w:tr>
+      <w:tr>
+        <w:tc>
+          <w:tcPr>
+            <w:tcW w:type="dxa" w:w="2500"/>
+          </w:tcPr>
+          <w:p>
+            <w:r>
+              <w:t>Newsletters</w:t>
+            </w:r>
+          </w:p>
+        </w:tc>
+        <w:tc>
+          <w:tcPr>
+            <w:tcW w:type="dxa" w:w="3500"/>
+          </w:tcPr>
+          <w:p>
+            <w:r>
+              <w:t>No</w:t>
+            </w:r>
+          </w:p>
+        </w:tc>
+        <w:tc>
+          <w:tcPr>
+            <w:tcW w:type="dxa" w:w="3360"/>
+          </w:tcPr>
+          <w:p>
+            <w:r>
+              <w:t>Create, schedule and send newsletters</w:t>
+            </w:r>
+          </w:p>
+        </w:tc>
+      </w:tr>
+      <w:tr>
+        <w:tc>
+          <w:tcPr>
+            <w:tcW w:type="dxa" w:w="2500"/>
+          </w:tcPr>
+          <w:p>
+            <w:r>
+              <w:t>Invoices</w:t>
+            </w:r>
+          </w:p>
+        </w:tc>
+        <w:tc>
+          <w:tcPr>
+            <w:tcW w:type="dxa" w:w="3500"/>
+          </w:tcPr>
+          <w:p>
+            <w:r>
+              <w:t>No</w:t>
+            </w:r>
+          </w:p>
+        </w:tc>
+        <w:tc>
+          <w:tcPr>
+            <w:tcW w:type="dxa" w:w="3360"/>
+          </w:tcPr>
+          <w:p>
+            <w:r>
+              <w:t>Create and send invoices; may be linked to bookings</w:t>
             </w:r>
           </w:p>
         </w:tc>
@@ -8375,11 +8717,7 @@
     </w:p>
     <w:p>
       <w:r>
-        <w:rPr>
-          <w:sz w:val="24"/>
-          <w:szCs w:val="24"/>
-        </w:rPr>
-        <w:t xml:space="preserve">Note: the above limits are indicative starting points and should be reviewed before launch. Free trial provides paid-tier access for a set period (e.g. 30 days) after which the account reverts to free unless a subscription is taken. Display options that are not gated — showing a Google map of the primary address, showing or hiding the footer policy links, choosing a template colour scheme, and the sole-trader voice toggle — are available on all plans.</w:t>
+        <w:t>Note: the above limits are indicative starting points and should be reviewed before launch. Free trial provides paid-tier access for a set period (e.g. 30 days), after which the account reverts to free unless a subscription is taken. Display options that are not gated - showing a Google map of the primary address, showing or hiding the footer policy links, choosing a template colour scheme, and the sole-trader voice toggle - are available on all plans. Each business has one mini-site; Premium does not add extra mini-site pages.</w:t>
       </w:r>
     </w:p>
     <w:p>
@@ -8729,13 +9067,7 @@
           <w:numId w:val="2"/>
         </w:numPr>
       </w:pPr>
-      <w:r>
-        <w:rPr>
-          <w:sz w:val="24"/>
-          <w:szCs w:val="24"/>
-        </w:rPr>
-        <w:t xml:space="preserve">Online booking or appointment request integration.</w:t>
-      </w:r>
+      <w:r/>
     </w:p>
     <w:p>
       <w:pPr>

</xml_diff>